<commit_message>
feat(google-docs-compat): replace floating textboxes with borderless signature table
- Add master_v2.docx: strips all floating wp:anchor / VML pict runs,
  replaces with 4-column borderless signature table (signing space row +
  names row: Cố vấn | Lớp trưởng | Bí thư | Sinh viên)
- Remove 5 spacer paragraphs between grading table and sig table to
  prevent page overflow
- Update process_and_generate.py to use master_v2.docx and write student
  name via write_centered_score into tables[2].rows[1].cells[3]
- Student name no longer requires tab/space padding or w:br hacks
</commit_message>
<xml_diff>
--- a/generated_students/Bùi Thanh Minh_N25DECE057.docx
+++ b/generated_students/Bùi Thanh Minh_N25DECE057.docx
@@ -9206,479 +9206,235 @@
         </w:tc>
       </w:tr>
     </w:tbl>
-    <w:p>
-      <w:pPr>
-        <w:rPr>
-          <w:b/>
-          <w:bCs/>
-          <w:sz w:val="26"/>
-          <w:szCs w:val="26"/>
-          <w:u w:val="single"/>
-          <w:lang w:val="de-DE"/>
-        </w:rPr>
-      </w:pPr>
-    </w:p>
-    <w:p>
-      <w:pPr>
-        <w:rPr>
-          <w:b/>
-          <w:bCs/>
-          <w:sz w:val="26"/>
-          <w:szCs w:val="26"/>
-          <w:u w:val="single"/>
-          <w:lang w:val="de-DE"/>
-        </w:rPr>
-      </w:pPr>
-    </w:p>
-    <w:p>
-      <w:pPr>
-        <w:rPr>
-          <w:b/>
-          <w:bCs/>
-          <w:sz w:val="26"/>
-          <w:szCs w:val="26"/>
-          <w:u w:val="single"/>
-          <w:lang w:val="de-DE"/>
-        </w:rPr>
-      </w:pPr>
-    </w:p>
-    <w:p>
-      <w:pPr>
-        <w:rPr>
-          <w:b/>
-          <w:bCs/>
-          <w:sz w:val="26"/>
-          <w:szCs w:val="26"/>
-          <w:u w:val="single"/>
-          <w:lang w:val="de-DE"/>
-        </w:rPr>
-      </w:pPr>
-      <w:r>
-        <w:rPr>
-          <w:bCs/>
-          <w:sz w:val="26"/>
-          <w:szCs w:val="26"/>
-          <w:lang w:val="de-DE"/>
-        </w:rPr>
-        <w:drawing>
-          <wp:anchor distT="0" distB="0" distL="114300" distR="114300" simplePos="0" relativeHeight="251661312" behindDoc="1" locked="0" layoutInCell="1" allowOverlap="1">
-            <wp:simplePos x="0" y="0"/>
-            <wp:positionH relativeFrom="column">
-              <wp:posOffset>3163570</wp:posOffset>
-            </wp:positionH>
-            <wp:positionV relativeFrom="paragraph">
-              <wp:posOffset>90805</wp:posOffset>
-            </wp:positionV>
-            <wp:extent cx="1280160" cy="533400"/>
-            <wp:effectExtent l="0" t="0" r="0" b="0"/>
-            <wp:wrapNone/>
-            <wp:docPr id="4" name="Picture 39"/>
-            <wp:cNvGraphicFramePr>
-              <a:graphicFrameLocks xmlns:a="http://schemas.openxmlformats.org/drawingml/2006/main" noChangeAspect="1"/>
-            </wp:cNvGraphicFramePr>
-            <a:graphic xmlns:a="http://schemas.openxmlformats.org/drawingml/2006/main">
-              <a:graphicData uri="http://schemas.openxmlformats.org/drawingml/2006/picture">
-                <pic:pic xmlns:pic="http://schemas.openxmlformats.org/drawingml/2006/picture">
-                  <pic:nvPicPr>
-                    <pic:cNvPr id="4" name="Picture 39"/>
-                    <pic:cNvPicPr>
-                      <a:picLocks noChangeAspect="1"/>
-                    </pic:cNvPicPr>
-                  </pic:nvPicPr>
-                  <pic:blipFill>
-                    <a:blip r:embed="rId4"/>
-                    <a:stretch>
-                      <a:fillRect/>
-                    </a:stretch>
-                  </pic:blipFill>
-                  <pic:spPr>
-                    <a:xfrm>
-                      <a:off x="0" y="0"/>
-                      <a:ext cx="1280160" cy="533400"/>
-                    </a:xfrm>
-                    <a:prstGeom prst="rect">
-                      <a:avLst/>
-                    </a:prstGeom>
-                    <a:noFill/>
-                    <a:ln>
-                      <a:noFill/>
-                    </a:ln>
-                  </pic:spPr>
-                </pic:pic>
-              </a:graphicData>
-            </a:graphic>
-          </wp:anchor>
-        </w:drawing>
-      </w:r>
-      <w:r>
-        <w:rPr>
-          <w:bCs/>
-          <w:sz w:val="26"/>
-          <w:szCs w:val="26"/>
-          <w:lang w:val="de-DE"/>
-        </w:rPr>
-        <w:drawing>
-          <wp:anchor distT="0" distB="0" distL="114300" distR="114300" simplePos="0" relativeHeight="251659264" behindDoc="0" locked="0" layoutInCell="1" allowOverlap="1">
-            <wp:simplePos x="0" y="0"/>
-            <wp:positionH relativeFrom="column">
-              <wp:posOffset>-304800</wp:posOffset>
-            </wp:positionH>
-            <wp:positionV relativeFrom="paragraph">
-              <wp:posOffset>128905</wp:posOffset>
-            </wp:positionV>
-            <wp:extent cx="1676400" cy="289560"/>
-            <wp:effectExtent l="0" t="0" r="0" b="15240"/>
-            <wp:wrapNone/>
-            <wp:docPr id="3" name="Picture 36"/>
-            <wp:cNvGraphicFramePr>
-              <a:graphicFrameLocks xmlns:a="http://schemas.openxmlformats.org/drawingml/2006/main" noChangeAspect="1"/>
-            </wp:cNvGraphicFramePr>
-            <a:graphic xmlns:a="http://schemas.openxmlformats.org/drawingml/2006/main">
-              <a:graphicData uri="http://schemas.openxmlformats.org/drawingml/2006/picture">
-                <pic:pic xmlns:pic="http://schemas.openxmlformats.org/drawingml/2006/picture">
-                  <pic:nvPicPr>
-                    <pic:cNvPr id="3" name="Picture 36"/>
-                    <pic:cNvPicPr>
-                      <a:picLocks noChangeAspect="1"/>
-                    </pic:cNvPicPr>
-                  </pic:nvPicPr>
-                  <pic:blipFill>
-                    <a:blip r:embed="rId5"/>
-                    <a:stretch>
-                      <a:fillRect/>
-                    </a:stretch>
-                  </pic:blipFill>
-                  <pic:spPr>
-                    <a:xfrm>
-                      <a:off x="0" y="0"/>
-                      <a:ext cx="1676400" cy="289560"/>
-                    </a:xfrm>
-                    <a:prstGeom prst="rect">
-                      <a:avLst/>
-                    </a:prstGeom>
-                    <a:noFill/>
-                    <a:ln>
-                      <a:noFill/>
-                    </a:ln>
-                  </pic:spPr>
-                </pic:pic>
-              </a:graphicData>
-            </a:graphic>
-          </wp:anchor>
-        </w:drawing>
-      </w:r>
-    </w:p>
-    <w:p>
-      <w:pPr>
-        <w:rPr>
-          <w:bCs/>
-          <w:sz w:val="26"/>
-          <w:szCs w:val="26"/>
-          <w:lang w:val="de-DE"/>
-        </w:rPr>
-      </w:pPr>
-      <w:r>
-        <mc:AlternateContent>
-          <mc:Choice Requires="wps">
-            <w:drawing>
-              <wp:anchor distT="45720" distB="45720" distL="114300" distR="114300" simplePos="0" relativeHeight="251662336" behindDoc="1" locked="0" layoutInCell="1" allowOverlap="1">
-                <wp:simplePos x="0" y="0"/>
-                <wp:positionH relativeFrom="column">
-                  <wp:posOffset>4503420</wp:posOffset>
-                </wp:positionH>
-                <wp:positionV relativeFrom="paragraph">
-                  <wp:posOffset>8793480</wp:posOffset>
-                </wp:positionV>
-                <wp:extent cx="1280160" cy="525780"/>
-                <wp:effectExtent l="0" t="0" r="0" b="0"/>
-                <wp:wrapNone/>
-                <wp:docPr id="5" name="Text Box 2"/>
-                <wp:cNvGraphicFramePr/>
-                <a:graphic xmlns:a="http://schemas.openxmlformats.org/drawingml/2006/main">
-                  <a:graphicData uri="http://schemas.microsoft.com/office/word/2010/wordprocessingShape">
-                    <wps:wsp>
-                      <wps:cNvSpPr txBox="1">
-                        <a:spLocks noChangeArrowheads="1"/>
-                      </wps:cNvSpPr>
-                      <wps:spPr bwMode="auto">
-                        <a:xfrm>
-                          <a:off x="0" y="0"/>
-                          <a:ext cx="1280160" cy="525780"/>
-                        </a:xfrm>
-                        <a:prstGeom prst="rect">
-                          <a:avLst/>
-                        </a:prstGeom>
-                        <a:noFill/>
-                        <a:ln>
-                          <a:noFill/>
-                        </a:ln>
-                        <a:effectLst/>
-                      </wps:spPr>
-                      <wps:txbx>
-                        <w:txbxContent>
-                          <w:p>
-                            <w:pPr>
-                              <w:jc w:val="center"/>
-                              <w:rPr>
-                                <w:sz w:val="26"/>
-                                <w:szCs w:val="26"/>
-                              </w:rPr>
-                            </w:pPr>
-                            <w:r>
-                              <w:rPr>
-                                <w:sz w:val="26"/>
-                                <w:szCs w:val="26"/>
-                              </w:rPr>
-                              <w:t>Nguyễn Phương</w:t>
-                            </w:r>
-                          </w:p>
-                          <w:p>
-                            <w:pPr>
-                              <w:jc w:val="center"/>
-                            </w:pPr>
-                            <w:r>
-                              <w:rPr>
-                                <w:sz w:val="26"/>
-                                <w:szCs w:val="26"/>
-                              </w:rPr>
-                              <w:t>Quốc Vương</w:t>
-                            </w:r>
-                          </w:p>
-                        </w:txbxContent>
-                      </wps:txbx>
-                      <wps:bodyPr rot="0" vert="horz" wrap="square" lIns="91440" tIns="45720" rIns="91440" bIns="45720" anchor="t" anchorCtr="0">
-                        <a:noAutofit/>
-                      </wps:bodyPr>
-                    </wps:wsp>
-                  </a:graphicData>
-                </a:graphic>
-              </wp:anchor>
-            </w:drawing>
-          </mc:Choice>
-          <mc:Fallback>
-            <w:pict>
-              <v:shape id="Text Box 2" o:spid="_x0000_s1026" o:spt="202" type="#_x0000_t202" style="position:absolute;left:0pt;margin-left:354.6pt;margin-top:692.4pt;height:41.4pt;width:100.8pt;z-index:-251654144;mso-width-relative:page;mso-height-relative:page;" filled="f" stroked="f" coordsize="21600,21600" o:gfxdata="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">
-                <v:fill on="f" focussize="0,0"/>
-                <v:stroke on="f"/>
-                <v:imagedata o:title=""/>
-                <o:lock v:ext="edit" aspectratio="f"/>
-                <v:textbox>
-                  <w:txbxContent>
-                    <w:p>
-                      <w:pPr>
-                        <w:jc w:val="center"/>
-                        <w:rPr>
-                          <w:sz w:val="26"/>
-                          <w:szCs w:val="26"/>
-                        </w:rPr>
-                      </w:pPr>
-                      <w:r>
-                        <w:rPr>
-                          <w:sz w:val="26"/>
-                          <w:szCs w:val="26"/>
-                        </w:rPr>
-                        <w:t>Nguyễn Phương</w:t>
-                      </w:r>
-                    </w:p>
-                    <w:p>
-                      <w:pPr>
-                        <w:jc w:val="center"/>
-                      </w:pPr>
-                      <w:r>
-                        <w:rPr>
-                          <w:sz w:val="26"/>
-                          <w:szCs w:val="26"/>
-                        </w:rPr>
-                        <w:t>Quốc Vương</w:t>
-                      </w:r>
-                    </w:p>
-                  </w:txbxContent>
-                </v:textbox>
-              </v:shape>
-            </w:pict>
-          </mc:Fallback>
-        </mc:AlternateContent>
-      </w:r>
-      <w:r>
-        <mc:AlternateContent>
-          <mc:Choice Requires="wps">
-            <w:drawing>
-              <wp:anchor distT="45720" distB="45720" distL="114300" distR="114300" simplePos="0" relativeHeight="251660288" behindDoc="1" locked="0" layoutInCell="1" allowOverlap="1">
-                <wp:simplePos x="0" y="0"/>
-                <wp:positionH relativeFrom="column">
-                  <wp:posOffset>4503420</wp:posOffset>
-                </wp:positionH>
-                <wp:positionV relativeFrom="paragraph">
-                  <wp:posOffset>8793480</wp:posOffset>
-                </wp:positionV>
-                <wp:extent cx="1280160" cy="525780"/>
-                <wp:effectExtent l="0" t="0" r="0" b="0"/>
-                <wp:wrapNone/>
-                <wp:docPr id="217" name="Text Box 2"/>
-                <wp:cNvGraphicFramePr/>
-                <a:graphic xmlns:a="http://schemas.openxmlformats.org/drawingml/2006/main">
-                  <a:graphicData uri="http://schemas.microsoft.com/office/word/2010/wordprocessingShape">
-                    <wps:wsp>
-                      <wps:cNvSpPr txBox="1">
-                        <a:spLocks noChangeArrowheads="1"/>
-                      </wps:cNvSpPr>
-                      <wps:spPr bwMode="auto">
-                        <a:xfrm>
-                          <a:off x="0" y="0"/>
-                          <a:ext cx="1280160" cy="525780"/>
-                        </a:xfrm>
-                        <a:prstGeom prst="rect">
-                          <a:avLst/>
-                        </a:prstGeom>
-                        <a:noFill/>
-                        <a:ln>
-                          <a:noFill/>
-                        </a:ln>
-                        <a:effectLst/>
-                      </wps:spPr>
-                      <wps:txbx>
-                        <w:txbxContent>
-                          <w:p>
-                            <w:pPr>
-                              <w:jc w:val="center"/>
-                              <w:rPr>
-                                <w:sz w:val="26"/>
-                                <w:szCs w:val="26"/>
-                              </w:rPr>
-                            </w:pPr>
-                            <w:r>
-                              <w:rPr>
-                                <w:sz w:val="26"/>
-                                <w:szCs w:val="26"/>
-                              </w:rPr>
-                              <w:t/>
-                            </w:r>
-                          </w:p>
-                          <w:p>
-                            <w:pPr>
-                              <w:jc w:val="center"/>
-                            </w:pPr>
-                            <w:r>
-                              <w:rPr>
-                                <w:sz w:val="26"/>
-                                <w:szCs w:val="26"/>
-                              </w:rPr>
-                              <w:t/>
-                            </w:r>
-                          </w:p>
-                        </w:txbxContent>
-                      </wps:txbx>
-                      <wps:bodyPr rot="0" vert="horz" wrap="square" lIns="91440" tIns="45720" rIns="91440" bIns="45720" anchor="t" anchorCtr="0">
-                        <a:noAutofit/>
-                      </wps:bodyPr>
-                    </wps:wsp>
-                  </a:graphicData>
-                </a:graphic>
-              </wp:anchor>
-            </w:drawing>
-          </mc:Choice>
-          <mc:Fallback>
-            <w:pict>
-              <v:shape id="Text Box 2" o:spid="_x0000_s1026" o:spt="202" type="#_x0000_t202" style="position:absolute;left:0pt;margin-left:354.6pt;margin-top:692.4pt;height:41.4pt;width:100.8pt;z-index:-251656192;mso-width-relative:page;mso-height-relative:page;" filled="f" stroked="f" coordsize="21600,21600" o:gfxdata="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">
-                <v:fill on="f" focussize="0,0"/>
-                <v:stroke on="f"/>
-                <v:imagedata o:title=""/>
-                <o:lock v:ext="edit" aspectratio="f"/>
-                <v:textbox>
-                  <w:txbxContent>
-                    <w:p>
-                      <w:pPr>
-                        <w:jc w:val="center"/>
-                        <w:rPr>
-                          <w:sz w:val="26"/>
-                          <w:szCs w:val="26"/>
-                        </w:rPr>
-                      </w:pPr>
-                      <w:r>
-                        <w:rPr>
-                          <w:sz w:val="26"/>
-                          <w:szCs w:val="26"/>
-                        </w:rPr>
-                        <w:t/>
-                      </w:r>
-                    </w:p>
-                    <w:p>
-                      <w:pPr>
-                        <w:jc w:val="center"/>
-                      </w:pPr>
-                      <w:r>
-                        <w:rPr>
-                          <w:sz w:val="26"/>
-                          <w:szCs w:val="26"/>
-                        </w:rPr>
-                        <w:t/>
-                      </w:r>
-                    </w:p>
-                  </w:txbxContent>
-                </v:textbox>
-              </v:shape>
-            </w:pict>
-          </mc:Fallback>
-        </mc:AlternateContent>
-      </w:r>
-      <w:r>
-        <w:rPr>
-          <w:bCs/>
-          <w:sz w:val="26"/>
-          <w:szCs w:val="26"/>
-          <w:lang w:val="de-DE"/>
-        </w:rPr>
-        <w:t>........................</w:t>
-      </w:r>
-      <w:r>
-        <w:rPr>
-          <w:bCs/>
-          <w:sz w:val="26"/>
-          <w:szCs w:val="26"/>
-          <w:lang w:val="de-DE"/>
-        </w:rPr>
-        <w:tab/>
-      </w:r>
-      <w:r>
-        <w:rPr>
-          <w:bCs/>
-          <w:sz w:val="26"/>
-          <w:szCs w:val="26"/>
-          <w:lang w:val="de-DE"/>
-        </w:rPr>
-        <w:t xml:space="preserve">       Ngô Trí Long</w:t>
-      </w:r>
-      <w:r>
-        <w:rPr>
-          <w:bCs/>
-          <w:sz w:val="26"/>
-          <w:szCs w:val="26"/>
-          <w:lang w:val="de-DE"/>
-        </w:rPr>
-        <w:tab/>
-      </w:r>
-      <w:r>
-        <w:rPr>
-          <w:bCs/>
-          <w:sz w:val="26"/>
-          <w:szCs w:val="26"/>
-          <w:lang w:val="de-DE"/>
-        </w:rPr>
-        <w:tab/>
-        <w:t xml:space="preserve">                                       Bùi Thanh</w:t>
-      </w:r>
-    </w:p>
-    <w:p>
-      <w:pPr>
-        <w:spacing w:before="0" w:after="0" w:line="276" w:lineRule="auto"/>
-      </w:pPr>
-      <w:r>
-        <w:rPr>
-          <w:sz w:val="26"/>
-        </w:rPr>
-        <w:t xml:space="preserve">                                                                                                                        Minh</w:t>
-      </w:r>
-    </w:p>
+    <w:tbl>
+      <w:tblPr>
+        <w:tblStyle w:val="17"/>
+        <w:tblW w:type="auto" w:w="0"/>
+        <w:tblLook w:firstColumn="1" w:firstRow="1" w:lastColumn="0" w:lastRow="0" w:noHBand="0" w:noVBand="1" w:val="04A0"/>
+      </w:tblPr>
+      <w:tblGrid>
+        <w:gridCol w:w="2317"/>
+        <w:gridCol w:w="2317"/>
+        <w:gridCol w:w="2317"/>
+        <w:gridCol w:w="2317"/>
+      </w:tblGrid>
+      <w:tr>
+        <w:trPr>
+          <w:trHeight w:val="720" w:hRule="exact"/>
+          <w:trHeight w:val="720" w:hRule="exact"/>
+          <w:trHeight w:val="720" w:hRule="exact"/>
+          <w:trHeight w:val="720" w:hRule="exact"/>
+        </w:trPr>
+        <w:tc>
+          <w:tcPr>
+            <w:tcW w:type="dxa" w:w="2324"/>
+            <w:tcBorders>
+              <w:top w:val="none"/>
+              <w:left w:val="none"/>
+              <w:bottom w:val="none"/>
+              <w:right w:val="none"/>
+              <w:insideH w:val="none"/>
+              <w:insideV w:val="none"/>
+            </w:tcBorders>
+          </w:tcPr>
+          <w:p>
+            <w:pPr>
+              <w:jc w:val="center"/>
+            </w:pPr>
+            <w:r/>
+            <w:r>
+              <w:rPr>
+                <w:rFonts w:ascii="Times New Roman" w:hAnsi="Times New Roman"/>
+                <w:b w:val="0"/>
+                <w:sz w:val="26"/>
+              </w:rPr>
+            </w:r>
+          </w:p>
+        </w:tc>
+        <w:tc>
+          <w:tcPr>
+            <w:tcW w:type="dxa" w:w="2324"/>
+            <w:tcBorders>
+              <w:top w:val="none"/>
+              <w:left w:val="none"/>
+              <w:bottom w:val="none"/>
+              <w:right w:val="none"/>
+              <w:insideH w:val="none"/>
+              <w:insideV w:val="none"/>
+            </w:tcBorders>
+          </w:tcPr>
+          <w:p>
+            <w:pPr>
+              <w:jc w:val="center"/>
+            </w:pPr>
+            <w:r/>
+            <w:r>
+              <w:rPr>
+                <w:rFonts w:ascii="Times New Roman" w:hAnsi="Times New Roman"/>
+                <w:b w:val="0"/>
+                <w:sz w:val="26"/>
+              </w:rPr>
+            </w:r>
+          </w:p>
+        </w:tc>
+        <w:tc>
+          <w:tcPr>
+            <w:tcW w:type="dxa" w:w="2324"/>
+            <w:tcBorders>
+              <w:top w:val="none"/>
+              <w:left w:val="none"/>
+              <w:bottom w:val="none"/>
+              <w:right w:val="none"/>
+              <w:insideH w:val="none"/>
+              <w:insideV w:val="none"/>
+            </w:tcBorders>
+          </w:tcPr>
+          <w:p>
+            <w:pPr>
+              <w:jc w:val="center"/>
+            </w:pPr>
+            <w:r/>
+            <w:r>
+              <w:rPr>
+                <w:rFonts w:ascii="Times New Roman" w:hAnsi="Times New Roman"/>
+                <w:b w:val="0"/>
+                <w:sz w:val="26"/>
+              </w:rPr>
+            </w:r>
+          </w:p>
+        </w:tc>
+        <w:tc>
+          <w:tcPr>
+            <w:tcW w:type="dxa" w:w="2324"/>
+            <w:tcBorders>
+              <w:top w:val="none"/>
+              <w:left w:val="none"/>
+              <w:bottom w:val="none"/>
+              <w:right w:val="none"/>
+              <w:insideH w:val="none"/>
+              <w:insideV w:val="none"/>
+            </w:tcBorders>
+          </w:tcPr>
+          <w:p>
+            <w:pPr>
+              <w:jc w:val="center"/>
+            </w:pPr>
+            <w:r/>
+            <w:r>
+              <w:rPr>
+                <w:rFonts w:ascii="Times New Roman" w:hAnsi="Times New Roman"/>
+                <w:b w:val="0"/>
+                <w:sz w:val="26"/>
+              </w:rPr>
+            </w:r>
+          </w:p>
+        </w:tc>
+      </w:tr>
+      <w:tr>
+        <w:tc>
+          <w:tcPr>
+            <w:tcW w:type="dxa" w:w="2324"/>
+            <w:tcBorders>
+              <w:top w:val="none"/>
+              <w:left w:val="none"/>
+              <w:bottom w:val="none"/>
+              <w:right w:val="none"/>
+              <w:insideH w:val="none"/>
+              <w:insideV w:val="none"/>
+            </w:tcBorders>
+          </w:tcPr>
+          <w:p>
+            <w:pPr>
+              <w:jc w:val="center"/>
+            </w:pPr>
+            <w:r/>
+            <w:r>
+              <w:rPr>
+                <w:rFonts w:ascii="Times New Roman" w:hAnsi="Times New Roman"/>
+                <w:b w:val="0"/>
+                <w:sz w:val="26"/>
+              </w:rPr>
+              <w:t>Nguyễn Trung Hiệu</w:t>
+            </w:r>
+          </w:p>
+        </w:tc>
+        <w:tc>
+          <w:tcPr>
+            <w:tcW w:type="dxa" w:w="2324"/>
+            <w:tcBorders>
+              <w:top w:val="none"/>
+              <w:left w:val="none"/>
+              <w:bottom w:val="none"/>
+              <w:right w:val="none"/>
+              <w:insideH w:val="none"/>
+              <w:insideV w:val="none"/>
+            </w:tcBorders>
+          </w:tcPr>
+          <w:p>
+            <w:pPr>
+              <w:jc w:val="center"/>
+            </w:pPr>
+            <w:r/>
+            <w:r>
+              <w:rPr>
+                <w:rFonts w:ascii="Times New Roman" w:hAnsi="Times New Roman"/>
+                <w:b w:val="0"/>
+                <w:sz w:val="26"/>
+              </w:rPr>
+              <w:t>Ngô Trí Long</w:t>
+            </w:r>
+          </w:p>
+        </w:tc>
+        <w:tc>
+          <w:tcPr>
+            <w:tcW w:type="dxa" w:w="2324"/>
+            <w:tcBorders>
+              <w:top w:val="none"/>
+              <w:left w:val="none"/>
+              <w:bottom w:val="none"/>
+              <w:right w:val="none"/>
+              <w:insideH w:val="none"/>
+              <w:insideV w:val="none"/>
+            </w:tcBorders>
+          </w:tcPr>
+          <w:p>
+            <w:pPr>
+              <w:jc w:val="center"/>
+            </w:pPr>
+            <w:r/>
+            <w:r>
+              <w:rPr>
+                <w:rFonts w:ascii="Times New Roman" w:hAnsi="Times New Roman"/>
+                <w:b w:val="0"/>
+                <w:sz w:val="26"/>
+              </w:rPr>
+              <w:t>Nguyễn Phương Quốc Vương</w:t>
+            </w:r>
+          </w:p>
+        </w:tc>
+        <w:tc>
+          <w:tcPr>
+            <w:tcW w:type="dxa" w:w="2324"/>
+            <w:tcBorders>
+              <w:top w:val="none"/>
+              <w:left w:val="none"/>
+              <w:bottom w:val="none"/>
+              <w:right w:val="none"/>
+              <w:insideH w:val="none"/>
+              <w:insideV w:val="none"/>
+            </w:tcBorders>
+          </w:tcPr>
+          <w:p>
+            <w:pPr>
+              <w:jc w:val="center"/>
+            </w:pPr>
+            <w:r>
+              <w:t>Bùi Thanh Minh</w:t>
+            </w:r>
+          </w:p>
+        </w:tc>
+      </w:tr>
+    </w:tbl>
     <w:sectPr>
       <w:pgSz w:w="11907" w:h="16840"/>
       <w:pgMar w:top="567" w:right="657" w:bottom="284" w:left="1980" w:header="567" w:footer="720" w:gutter="0"/>

</xml_diff>

<commit_message>
fix: replace tab-spaced info paragraphs with 2x2 borderless table
- Info section (Name/DOB and ID/Class) replaced with a 2-row x 2-col
  borderless table in master_v2.docx — no more tab stop drift in GDocs
- DOB and Class columns explicitly right-aligned (alignment=2)
- Absent students have DOB placeholder cleared to 'Ngày sinh:'
- Grading table refs updated from tables[1] to tables[2]
- Signature table refs updated from tables[2] to tables[3]
</commit_message>
<xml_diff>
--- a/generated_students/Bùi Thanh Minh_N25DECE057.docx
+++ b/generated_students/Bùi Thanh Minh_N25DECE057.docx
@@ -190,100 +190,103 @@
         <w:t>Học kỳ: II      Năm học: 2025-2026</w:t>
       </w:r>
     </w:p>
-    <w:p>
-      <w:pPr>
-        <w:spacing w:before="60" w:after="60" w:line="340" w:lineRule="exact"/>
-        <w:rPr>
-          <w:lang w:val="de-DE"/>
-        </w:rPr>
-      </w:pPr>
-      <w:r>
-        <w:rPr>
-          <w:lang w:val="de-DE"/>
-        </w:rPr>
-        <w:t>Họ và tên: Bùi Thanh Minh</w:t>
-      </w:r>
-      <w:r>
-        <w:rPr>
-          <w:lang w:val="de-DE"/>
-        </w:rPr>
-        <w:tab/>
-      </w:r>
-      <w:r>
-        <w:rPr>
-          <w:lang w:val="de-DE"/>
-        </w:rPr>
-        <w:tab/>
-      </w:r>
-      <w:r>
-        <w:rPr>
-          <w:lang w:val="de-DE"/>
-        </w:rPr>
-        <w:tab/>
-      </w:r>
-      <w:r>
-        <w:rPr>
-          <w:lang w:val="de-DE"/>
-        </w:rPr>
-        <w:tab/>
-      </w:r>
-      <w:r>
-        <w:rPr>
-          <w:lang w:val="de-DE"/>
-        </w:rPr>
-        <w:tab/>
-      </w:r>
-      <w:r>
-        <w:rPr>
-          <w:lang w:val="de-DE"/>
-        </w:rPr>
-        <w:tab/>
-      </w:r>
-      <w:r>
-        <w:rPr>
-          <w:lang w:val="de-DE"/>
-        </w:rPr>
-        <w:t>Ngày sinh: 02/01/2007</w:t>
-      </w:r>
-    </w:p>
-    <w:p>
-      <w:pPr>
-        <w:spacing w:before="60" w:after="60" w:line="340" w:lineRule="exact"/>
-        <w:rPr>
-          <w:lang w:val="de-DE"/>
-        </w:rPr>
-      </w:pPr>
-      <w:r>
-        <w:rPr>
-          <w:lang w:val="de-DE"/>
-        </w:rPr>
-        <w:t xml:space="preserve">Mã số sinh viên: N25DECE057  </w:t>
-      </w:r>
-      <w:r>
-        <w:rPr>
-          <w:lang w:val="de-DE"/>
-        </w:rPr>
-        <w:tab/>
-      </w:r>
-      <w:r>
-        <w:rPr>
-          <w:lang w:val="de-DE"/>
-        </w:rPr>
-        <w:tab/>
-      </w:r>
-      <w:r>
-        <w:rPr>
-          <w:lang w:val="de-DE"/>
-        </w:rPr>
-        <w:tab/>
-      </w:r>
-      <w:r>
-        <w:rPr>
-          <w:lang w:val="de-DE"/>
-        </w:rPr>
-        <w:t>Lớp: E25CQCE02-N</w:t>
-      </w:r>
-    </w:p>
+    <w:tbl>
+      <w:tblPr>
+        <w:tblW w:type="auto" w:w="0"/>
+        <w:tblLook w:firstColumn="1" w:firstRow="1" w:lastColumn="0" w:lastRow="0" w:noHBand="0" w:noVBand="1" w:val="04A0"/>
+      </w:tblPr>
+      <w:tblGrid>
+        <w:gridCol w:w="4635"/>
+        <w:gridCol w:w="4635"/>
+      </w:tblGrid>
+      <w:tr>
+        <w:tc>
+          <w:tcPr>
+            <w:tcW w:type="dxa" w:w="6236"/>
+            <w:tcBorders>
+              <w:top w:val="none"/>
+              <w:left w:val="none"/>
+              <w:bottom w:val="none"/>
+              <w:right w:val="none"/>
+              <w:insideH w:val="none"/>
+              <w:insideV w:val="none"/>
+            </w:tcBorders>
+          </w:tcPr>
+          <w:p>
+            <w:r>
+              <w:t>Họ và tên: Bùi Thanh Minh</w:t>
+            </w:r>
+          </w:p>
+        </w:tc>
+        <w:tc>
+          <w:tcPr>
+            <w:tcW w:type="dxa" w:w="3118"/>
+            <w:tcBorders>
+              <w:top w:val="none"/>
+              <w:left w:val="none"/>
+              <w:bottom w:val="none"/>
+              <w:right w:val="none"/>
+              <w:insideH w:val="none"/>
+              <w:insideV w:val="none"/>
+            </w:tcBorders>
+          </w:tcPr>
+          <w:p>
+            <w:pPr>
+              <w:jc w:val="right"/>
+            </w:pPr>
+            <w:r>
+              <w:t>Ngày sinh: 02/01/2007</w:t>
+            </w:r>
+          </w:p>
+        </w:tc>
+      </w:tr>
+      <w:tr>
+        <w:tc>
+          <w:tcPr>
+            <w:tcW w:type="dxa" w:w="6236"/>
+            <w:tcBorders>
+              <w:top w:val="none"/>
+              <w:left w:val="none"/>
+              <w:bottom w:val="none"/>
+              <w:right w:val="none"/>
+              <w:insideH w:val="none"/>
+              <w:insideV w:val="none"/>
+            </w:tcBorders>
+          </w:tcPr>
+          <w:p>
+            <w:r>
+              <w:t>Mã số sinh viên: N25DECE057</w:t>
+            </w:r>
+          </w:p>
+        </w:tc>
+        <w:tc>
+          <w:tcPr>
+            <w:tcW w:type="dxa" w:w="3118"/>
+            <w:tcBorders>
+              <w:top w:val="none"/>
+              <w:left w:val="none"/>
+              <w:bottom w:val="none"/>
+              <w:right w:val="none"/>
+              <w:insideH w:val="none"/>
+              <w:insideV w:val="none"/>
+            </w:tcBorders>
+          </w:tcPr>
+          <w:p>
+            <w:pPr>
+              <w:jc w:val="right"/>
+            </w:pPr>
+            <w:r/>
+            <w:r>
+              <w:rPr>
+                <w:rFonts w:ascii="Times New Roman" w:hAnsi="Times New Roman"/>
+                <w:sz w:val="26"/>
+              </w:rPr>
+              <w:t>Lớp: E25CQCE02-N</w:t>
+            </w:r>
+          </w:p>
+        </w:tc>
+      </w:tr>
+    </w:tbl>
     <w:p>
       <w:pPr>
         <w:spacing w:before="60" w:after="60" w:line="340" w:lineRule="exact"/>

</xml_diff>

<commit_message>
fix: correct advisor name Hiệu → Hiếu (Nguyễn Trung Hiếu)
</commit_message>
<xml_diff>
--- a/generated_students/Bùi Thanh Minh_N25DECE057.docx
+++ b/generated_students/Bùi Thanh Minh_N25DECE057.docx
@@ -9350,14 +9350,8 @@
             <w:pPr>
               <w:jc w:val="center"/>
             </w:pPr>
-            <w:r/>
-            <w:r>
-              <w:rPr>
-                <w:rFonts w:ascii="Times New Roman" w:hAnsi="Times New Roman"/>
-                <w:b w:val="0"/>
-                <w:sz w:val="26"/>
-              </w:rPr>
-              <w:t>Nguyễn Trung Hiệu</w:t>
+            <w:r>
+              <w:t>Nguyễn Trung Hiếu</w:t>
             </w:r>
           </w:p>
         </w:tc>

</xml_diff>

<commit_message>
fix: align signature columns exactly with Table 2 headers
- Set Table 3 signature table columns to matching dxa widths: [2726, 2693, 2835, 2268]
- Set Table 3 left indentation to -612 twips to match Table 2's left indent
- Set allow_autofit = False on Table 3 to prevent Word from resizing columns
</commit_message>
<xml_diff>
--- a/generated_students/Bùi Thanh Minh_N25DECE057.docx
+++ b/generated_students/Bùi Thanh Minh_N25DECE057.docx
@@ -9216,6 +9216,7 @@
         <w:tblStyle w:val="17"/>
         <w:tblW w:type="auto" w:w="0"/>
         <w:tblLook w:firstColumn="1" w:firstRow="1" w:lastColumn="0" w:lastRow="0" w:noHBand="0" w:noVBand="1" w:val="04A0"/>
+        <w:tblInd w:w="-612" w:type="dxa"/>
       </w:tblPr>
       <w:tblGrid>
         <w:gridCol w:w="2317"/>
@@ -9232,7 +9233,7 @@
         </w:trPr>
         <w:tc>
           <w:tcPr>
-            <w:tcW w:type="dxa" w:w="2324"/>
+            <w:tcW w:type="dxa" w:w="2726"/>
             <w:tcBorders>
               <w:top w:val="none"/>
               <w:left w:val="none"/>
@@ -9258,7 +9259,7 @@
         </w:tc>
         <w:tc>
           <w:tcPr>
-            <w:tcW w:type="dxa" w:w="2324"/>
+            <w:tcW w:type="dxa" w:w="2693"/>
             <w:tcBorders>
               <w:top w:val="none"/>
               <w:left w:val="none"/>
@@ -9284,7 +9285,7 @@
         </w:tc>
         <w:tc>
           <w:tcPr>
-            <w:tcW w:type="dxa" w:w="2324"/>
+            <w:tcW w:type="dxa" w:w="2835"/>
             <w:tcBorders>
               <w:top w:val="none"/>
               <w:left w:val="none"/>
@@ -9310,7 +9311,7 @@
         </w:tc>
         <w:tc>
           <w:tcPr>
-            <w:tcW w:type="dxa" w:w="2324"/>
+            <w:tcW w:type="dxa" w:w="2268"/>
             <w:tcBorders>
               <w:top w:val="none"/>
               <w:left w:val="none"/>
@@ -9338,7 +9339,7 @@
       <w:tr>
         <w:tc>
           <w:tcPr>
-            <w:tcW w:type="dxa" w:w="2324"/>
+            <w:tcW w:type="dxa" w:w="2726"/>
             <w:tcBorders>
               <w:top w:val="none"/>
               <w:left w:val="none"/>
@@ -9359,7 +9360,7 @@
         </w:tc>
         <w:tc>
           <w:tcPr>
-            <w:tcW w:type="dxa" w:w="2324"/>
+            <w:tcW w:type="dxa" w:w="2693"/>
             <w:tcBorders>
               <w:top w:val="none"/>
               <w:left w:val="none"/>
@@ -9386,7 +9387,7 @@
         </w:tc>
         <w:tc>
           <w:tcPr>
-            <w:tcW w:type="dxa" w:w="2324"/>
+            <w:tcW w:type="dxa" w:w="2835"/>
             <w:tcBorders>
               <w:top w:val="none"/>
               <w:left w:val="none"/>
@@ -9413,7 +9414,7 @@
         </w:tc>
         <w:tc>
           <w:tcPr>
-            <w:tcW w:type="dxa" w:w="2324"/>
+            <w:tcW w:type="dxa" w:w="2268"/>
             <w:tcBorders>
               <w:top w:val="none"/>
               <w:left w:val="none"/>

</xml_diff>

<commit_message>
feat: embed advisor and bi thu digital signatures as inline table cell images
- Extract advisor_sig.png and bithu_sig.png from original master.docx
- Embed them as inline centered pictures inside Table 3 Row 0 Column 0 (Advisor) and Column 2 (Bí thư) in master_v2.docx
- Changed Row 0 height rule to 'atLeast' to prevent clipping of signatures
</commit_message>
<xml_diff>
--- a/generated_students/Bùi Thanh Minh_N25DECE057.docx
+++ b/generated_students/Bùi Thanh Minh_N25DECE057.docx
@@ -9226,7 +9226,7 @@
       </w:tblGrid>
       <w:tr>
         <w:trPr>
-          <w:trHeight w:val="720" w:hRule="exact"/>
+          <w:trHeight w:val="720" w:hRule="atLeast"/>
           <w:trHeight w:val="720" w:hRule="exact"/>
           <w:trHeight w:val="720" w:hRule="exact"/>
           <w:trHeight w:val="720" w:hRule="exact"/>
@@ -9245,15 +9245,43 @@
           </w:tcPr>
           <w:p>
             <w:pPr>
+              <w:spacing w:before="0" w:after="0" w:line="240" w:lineRule="auto"/>
               <w:jc w:val="center"/>
             </w:pPr>
             <w:r/>
             <w:r>
-              <w:rPr>
-                <w:rFonts w:ascii="Times New Roman" w:hAnsi="Times New Roman"/>
-                <w:b w:val="0"/>
-                <w:sz w:val="26"/>
-              </w:rPr>
+              <w:drawing>
+                <wp:inline xmlns:a="http://schemas.openxmlformats.org/drawingml/2006/main" xmlns:pic="http://schemas.openxmlformats.org/drawingml/2006/picture">
+                  <wp:extent cx="1677600" cy="288000"/>
+                  <wp:docPr id="1" name="Picture 1"/>
+                  <wp:cNvGraphicFramePr>
+                    <a:graphicFrameLocks noChangeAspect="1"/>
+                  </wp:cNvGraphicFramePr>
+                  <a:graphic>
+                    <a:graphicData uri="http://schemas.openxmlformats.org/drawingml/2006/picture">
+                      <pic:pic>
+                        <pic:nvPicPr>
+                          <pic:cNvPr id="0" name="image.png"/>
+                          <pic:cNvPicPr/>
+                        </pic:nvPicPr>
+                        <pic:blipFill>
+                          <a:blip r:embed="rId5"/>
+                          <a:stretch>
+                            <a:fillRect/>
+                          </a:stretch>
+                        </pic:blipFill>
+                        <pic:spPr>
+                          <a:xfrm>
+                            <a:off x="0" y="0"/>
+                            <a:ext cx="1677600" cy="288000"/>
+                          </a:xfrm>
+                          <a:prstGeom prst="rect"/>
+                        </pic:spPr>
+                      </pic:pic>
+                    </a:graphicData>
+                  </a:graphic>
+                </wp:inline>
+              </w:drawing>
             </w:r>
           </w:p>
         </w:tc>
@@ -9297,15 +9325,43 @@
           </w:tcPr>
           <w:p>
             <w:pPr>
+              <w:spacing w:before="0" w:after="0" w:line="240" w:lineRule="auto"/>
               <w:jc w:val="center"/>
             </w:pPr>
             <w:r/>
             <w:r>
-              <w:rPr>
-                <w:rFonts w:ascii="Times New Roman" w:hAnsi="Times New Roman"/>
-                <w:b w:val="0"/>
-                <w:sz w:val="26"/>
-              </w:rPr>
+              <w:drawing>
+                <wp:inline xmlns:a="http://schemas.openxmlformats.org/drawingml/2006/main" xmlns:pic="http://schemas.openxmlformats.org/drawingml/2006/picture">
+                  <wp:extent cx="1281600" cy="532800"/>
+                  <wp:docPr id="2" name="Picture 2"/>
+                  <wp:cNvGraphicFramePr>
+                    <a:graphicFrameLocks noChangeAspect="1"/>
+                  </wp:cNvGraphicFramePr>
+                  <a:graphic>
+                    <a:graphicData uri="http://schemas.openxmlformats.org/drawingml/2006/picture">
+                      <pic:pic>
+                        <pic:nvPicPr>
+                          <pic:cNvPr id="0" name="image.png"/>
+                          <pic:cNvPicPr/>
+                        </pic:nvPicPr>
+                        <pic:blipFill>
+                          <a:blip r:embed="rId4"/>
+                          <a:stretch>
+                            <a:fillRect/>
+                          </a:stretch>
+                        </pic:blipFill>
+                        <pic:spPr>
+                          <a:xfrm>
+                            <a:off x="0" y="0"/>
+                            <a:ext cx="1281600" cy="532800"/>
+                          </a:xfrm>
+                          <a:prstGeom prst="rect"/>
+                        </pic:spPr>
+                      </pic:pic>
+                    </a:graphicData>
+                  </a:graphic>
+                </wp:inline>
+              </w:drawing>
             </w:r>
           </w:p>
         </w:tc>

</xml_diff>

<commit_message>
feat: reinstate 2-line name split layout for student signature column
- Restored name-splitting logic for names with 3+ words (splits into first 2 words + remaining)
- Student signature cell uses a newline '\n' (which renders as a standard soft break) to wrap center-aligned
</commit_message>
<xml_diff>
--- a/generated_students/Bùi Thanh Minh_N25DECE057.docx
+++ b/generated_students/Bùi Thanh Minh_N25DECE057.docx
@@ -9485,7 +9485,9 @@
               <w:jc w:val="center"/>
             </w:pPr>
             <w:r>
-              <w:t>Bùi Thanh Minh</w:t>
+              <w:t>Bùi Thanh</w:t>
+              <w:br/>
+              <w:t>Minh</w:t>
             </w:r>
           </w:p>
         </w:tc>

</xml_diff>

<commit_message>
fix: remove printed name texts under Advisor and Bí thư signatures
- Set text names to empty string in Row 1 Col 0 (Advisor) and Col 2 (Bí thư)
- Keep Ngô Trí Long and the formatted Student names printed
- Updated build_master_v2.py configuration to match
</commit_message>
<xml_diff>
--- a/generated_students/Bùi Thanh Minh_N25DECE057.docx
+++ b/generated_students/Bùi Thanh Minh_N25DECE057.docx
@@ -9406,12 +9406,7 @@
             </w:tcBorders>
           </w:tcPr>
           <w:p>
-            <w:pPr>
-              <w:jc w:val="center"/>
-            </w:pPr>
-            <w:r>
-              <w:t>Nguyễn Trung Hiếu</w:t>
-            </w:r>
+            <w:r/>
           </w:p>
         </w:tc>
         <w:tc>
@@ -9454,18 +9449,7 @@
             </w:tcBorders>
           </w:tcPr>
           <w:p>
-            <w:pPr>
-              <w:jc w:val="center"/>
-            </w:pPr>
             <w:r/>
-            <w:r>
-              <w:rPr>
-                <w:rFonts w:ascii="Times New Roman" w:hAnsi="Times New Roman"/>
-                <w:b w:val="0"/>
-                <w:sz w:val="26"/>
-              </w:rPr>
-              <w:t>Nguyễn Phương Quốc Vương</w:t>
-            </w:r>
           </w:p>
         </w:tc>
         <w:tc>

</xml_diff>

<commit_message>
style: align digital signature images with text signatures in row 1
</commit_message>
<xml_diff>
--- a/generated_students/Bùi Thanh Minh_N25DECE057.docx
+++ b/generated_students/Bùi Thanh Minh_N25DECE057.docx
@@ -9244,6 +9244,72 @@
             </w:tcBorders>
           </w:tcPr>
           <w:p>
+            <w:r/>
+          </w:p>
+        </w:tc>
+        <w:tc>
+          <w:tcPr>
+            <w:tcW w:type="dxa" w:w="2693"/>
+            <w:tcBorders>
+              <w:top w:val="none"/>
+              <w:left w:val="none"/>
+              <w:bottom w:val="none"/>
+              <w:right w:val="none"/>
+              <w:insideH w:val="none"/>
+              <w:insideV w:val="none"/>
+            </w:tcBorders>
+          </w:tcPr>
+          <w:p>
+            <w:r/>
+          </w:p>
+        </w:tc>
+        <w:tc>
+          <w:tcPr>
+            <w:tcW w:type="dxa" w:w="2835"/>
+            <w:tcBorders>
+              <w:top w:val="none"/>
+              <w:left w:val="none"/>
+              <w:bottom w:val="none"/>
+              <w:right w:val="none"/>
+              <w:insideH w:val="none"/>
+              <w:insideV w:val="none"/>
+            </w:tcBorders>
+          </w:tcPr>
+          <w:p>
+            <w:r/>
+          </w:p>
+        </w:tc>
+        <w:tc>
+          <w:tcPr>
+            <w:tcW w:type="dxa" w:w="2268"/>
+            <w:tcBorders>
+              <w:top w:val="none"/>
+              <w:left w:val="none"/>
+              <w:bottom w:val="none"/>
+              <w:right w:val="none"/>
+              <w:insideH w:val="none"/>
+              <w:insideV w:val="none"/>
+            </w:tcBorders>
+          </w:tcPr>
+          <w:p>
+            <w:r/>
+          </w:p>
+        </w:tc>
+      </w:tr>
+      <w:tr>
+        <w:tc>
+          <w:tcPr>
+            <w:tcW w:type="dxa" w:w="2726"/>
+            <w:tcBorders>
+              <w:top w:val="none"/>
+              <w:left w:val="none"/>
+              <w:bottom w:val="none"/>
+              <w:right w:val="none"/>
+              <w:insideH w:val="none"/>
+              <w:insideV w:val="none"/>
+            </w:tcBorders>
+          </w:tcPr>
+          <w:p>
             <w:pPr>
               <w:spacing w:before="0" w:after="0" w:line="240" w:lineRule="auto"/>
               <w:jc w:val="center"/>
@@ -9305,9 +9371,9 @@
             <w:r>
               <w:rPr>
                 <w:rFonts w:ascii="Times New Roman" w:hAnsi="Times New Roman"/>
-                <w:b w:val="0"/>
                 <w:sz w:val="26"/>
               </w:rPr>
+              <w:t>Ngô Trí Long</w:t>
             </w:r>
           </w:p>
         </w:tc>
@@ -9363,93 +9429,6 @@
                 </wp:inline>
               </w:drawing>
             </w:r>
-          </w:p>
-        </w:tc>
-        <w:tc>
-          <w:tcPr>
-            <w:tcW w:type="dxa" w:w="2268"/>
-            <w:tcBorders>
-              <w:top w:val="none"/>
-              <w:left w:val="none"/>
-              <w:bottom w:val="none"/>
-              <w:right w:val="none"/>
-              <w:insideH w:val="none"/>
-              <w:insideV w:val="none"/>
-            </w:tcBorders>
-          </w:tcPr>
-          <w:p>
-            <w:pPr>
-              <w:jc w:val="center"/>
-            </w:pPr>
-            <w:r/>
-            <w:r>
-              <w:rPr>
-                <w:rFonts w:ascii="Times New Roman" w:hAnsi="Times New Roman"/>
-                <w:b w:val="0"/>
-                <w:sz w:val="26"/>
-              </w:rPr>
-            </w:r>
-          </w:p>
-        </w:tc>
-      </w:tr>
-      <w:tr>
-        <w:tc>
-          <w:tcPr>
-            <w:tcW w:type="dxa" w:w="2726"/>
-            <w:tcBorders>
-              <w:top w:val="none"/>
-              <w:left w:val="none"/>
-              <w:bottom w:val="none"/>
-              <w:right w:val="none"/>
-              <w:insideH w:val="none"/>
-              <w:insideV w:val="none"/>
-            </w:tcBorders>
-          </w:tcPr>
-          <w:p>
-            <w:r/>
-          </w:p>
-        </w:tc>
-        <w:tc>
-          <w:tcPr>
-            <w:tcW w:type="dxa" w:w="2693"/>
-            <w:tcBorders>
-              <w:top w:val="none"/>
-              <w:left w:val="none"/>
-              <w:bottom w:val="none"/>
-              <w:right w:val="none"/>
-              <w:insideH w:val="none"/>
-              <w:insideV w:val="none"/>
-            </w:tcBorders>
-          </w:tcPr>
-          <w:p>
-            <w:pPr>
-              <w:jc w:val="center"/>
-            </w:pPr>
-            <w:r/>
-            <w:r>
-              <w:rPr>
-                <w:rFonts w:ascii="Times New Roman" w:hAnsi="Times New Roman"/>
-                <w:b w:val="0"/>
-                <w:sz w:val="26"/>
-              </w:rPr>
-              <w:t>Ngô Trí Long</w:t>
-            </w:r>
-          </w:p>
-        </w:tc>
-        <w:tc>
-          <w:tcPr>
-            <w:tcW w:type="dxa" w:w="2835"/>
-            <w:tcBorders>
-              <w:top w:val="none"/>
-              <w:left w:val="none"/>
-              <w:bottom w:val="none"/>
-              <w:right w:val="none"/>
-              <w:insideH w:val="none"/>
-              <w:insideV w:val="none"/>
-            </w:tcBorders>
-          </w:tcPr>
-          <w:p>
-            <w:r/>
           </w:p>
         </w:tc>
         <w:tc>

</xml_diff>

<commit_message>
style: shrink signature image sizes and clear cell margins to prevent shifting in Google Docs mobile
</commit_message>
<xml_diff>
--- a/generated_students/Bùi Thanh Minh_N25DECE057.docx
+++ b/generated_students/Bùi Thanh Minh_N25DECE057.docx
@@ -9243,6 +9243,12 @@
               <w:insideH w:val="none"/>
               <w:insideV w:val="none"/>
             </w:tcBorders>
+            <w:tcMar>
+              <w:top w:w="0" w:type="dxa"/>
+              <w:left w:w="0" w:type="dxa"/>
+              <w:bottom w:w="0" w:type="dxa"/>
+              <w:right w:w="0" w:type="dxa"/>
+            </w:tcMar>
           </w:tcPr>
           <w:p>
             <w:r/>
@@ -9259,6 +9265,12 @@
               <w:insideH w:val="none"/>
               <w:insideV w:val="none"/>
             </w:tcBorders>
+            <w:tcMar>
+              <w:top w:w="0" w:type="dxa"/>
+              <w:left w:w="0" w:type="dxa"/>
+              <w:bottom w:w="0" w:type="dxa"/>
+              <w:right w:w="0" w:type="dxa"/>
+            </w:tcMar>
           </w:tcPr>
           <w:p>
             <w:r/>
@@ -9275,6 +9287,12 @@
               <w:insideH w:val="none"/>
               <w:insideV w:val="none"/>
             </w:tcBorders>
+            <w:tcMar>
+              <w:top w:w="0" w:type="dxa"/>
+              <w:left w:w="0" w:type="dxa"/>
+              <w:bottom w:w="0" w:type="dxa"/>
+              <w:right w:w="0" w:type="dxa"/>
+            </w:tcMar>
           </w:tcPr>
           <w:p>
             <w:r/>
@@ -9291,6 +9309,12 @@
               <w:insideH w:val="none"/>
               <w:insideV w:val="none"/>
             </w:tcBorders>
+            <w:tcMar>
+              <w:top w:w="0" w:type="dxa"/>
+              <w:left w:w="0" w:type="dxa"/>
+              <w:bottom w:w="0" w:type="dxa"/>
+              <w:right w:w="0" w:type="dxa"/>
+            </w:tcMar>
           </w:tcPr>
           <w:p>
             <w:r/>
@@ -9309,6 +9333,12 @@
               <w:insideH w:val="none"/>
               <w:insideV w:val="none"/>
             </w:tcBorders>
+            <w:tcMar>
+              <w:top w:w="0" w:type="dxa"/>
+              <w:left w:w="0" w:type="dxa"/>
+              <w:bottom w:w="0" w:type="dxa"/>
+              <w:right w:w="0" w:type="dxa"/>
+            </w:tcMar>
           </w:tcPr>
           <w:p>
             <w:pPr>
@@ -9319,8 +9349,8 @@
             <w:r>
               <w:drawing>
                 <wp:inline xmlns:a="http://schemas.openxmlformats.org/drawingml/2006/main" xmlns:pic="http://schemas.openxmlformats.org/drawingml/2006/picture">
-                  <wp:extent cx="1677600" cy="288000"/>
-                  <wp:docPr id="1" name="Picture 1"/>
+                  <wp:extent cx="1296000" cy="223200"/>
+                  <wp:docPr id="3" name="Picture 3"/>
                   <wp:cNvGraphicFramePr>
                     <a:graphicFrameLocks noChangeAspect="1"/>
                   </wp:cNvGraphicFramePr>
@@ -9340,7 +9370,7 @@
                         <pic:spPr>
                           <a:xfrm>
                             <a:off x="0" y="0"/>
-                            <a:ext cx="1677600" cy="288000"/>
+                            <a:ext cx="1296000" cy="223200"/>
                           </a:xfrm>
                           <a:prstGeom prst="rect"/>
                         </pic:spPr>
@@ -9363,6 +9393,12 @@
               <w:insideH w:val="none"/>
               <w:insideV w:val="none"/>
             </w:tcBorders>
+            <w:tcMar>
+              <w:top w:w="0" w:type="dxa"/>
+              <w:left w:w="0" w:type="dxa"/>
+              <w:bottom w:w="0" w:type="dxa"/>
+              <w:right w:w="0" w:type="dxa"/>
+            </w:tcMar>
           </w:tcPr>
           <w:p>
             <w:pPr>
@@ -9389,6 +9425,12 @@
               <w:insideH w:val="none"/>
               <w:insideV w:val="none"/>
             </w:tcBorders>
+            <w:tcMar>
+              <w:top w:w="0" w:type="dxa"/>
+              <w:left w:w="0" w:type="dxa"/>
+              <w:bottom w:w="0" w:type="dxa"/>
+              <w:right w:w="0" w:type="dxa"/>
+            </w:tcMar>
           </w:tcPr>
           <w:p>
             <w:pPr>
@@ -9399,8 +9441,8 @@
             <w:r>
               <w:drawing>
                 <wp:inline xmlns:a="http://schemas.openxmlformats.org/drawingml/2006/main" xmlns:pic="http://schemas.openxmlformats.org/drawingml/2006/picture">
-                  <wp:extent cx="1281600" cy="532800"/>
-                  <wp:docPr id="2" name="Picture 2"/>
+                  <wp:extent cx="1007999" cy="417600"/>
+                  <wp:docPr id="4" name="Picture 4"/>
                   <wp:cNvGraphicFramePr>
                     <a:graphicFrameLocks noChangeAspect="1"/>
                   </wp:cNvGraphicFramePr>
@@ -9420,7 +9462,7 @@
                         <pic:spPr>
                           <a:xfrm>
                             <a:off x="0" y="0"/>
-                            <a:ext cx="1281600" cy="532800"/>
+                            <a:ext cx="1007999" cy="417600"/>
                           </a:xfrm>
                           <a:prstGeom prst="rect"/>
                         </pic:spPr>
@@ -9443,6 +9485,12 @@
               <w:insideH w:val="none"/>
               <w:insideV w:val="none"/>
             </w:tcBorders>
+            <w:tcMar>
+              <w:top w:w="0" w:type="dxa"/>
+              <w:left w:w="0" w:type="dxa"/>
+              <w:bottom w:w="0" w:type="dxa"/>
+              <w:right w:w="0" w:type="dxa"/>
+            </w:tcMar>
           </w:tcPr>
           <w:p>
             <w:pPr>

</xml_diff>

<commit_message>
style: fix vertical text alignment by setting zero paragraph spacing on all cells in Row 1
</commit_message>
<xml_diff>
--- a/generated_students/Bùi Thanh Minh_N25DECE057.docx
+++ b/generated_students/Bùi Thanh Minh_N25DECE057.docx
@@ -9402,6 +9402,7 @@
           </w:tcPr>
           <w:p>
             <w:pPr>
+              <w:spacing w:before="0" w:after="0" w:line="240" w:lineRule="auto"/>
               <w:jc w:val="center"/>
             </w:pPr>
             <w:r/>
@@ -9494,9 +9495,15 @@
           </w:tcPr>
           <w:p>
             <w:pPr>
-              <w:jc w:val="center"/>
-            </w:pPr>
-            <w:r>
+              <w:spacing w:before="0" w:after="0" w:line="240" w:lineRule="auto"/>
+              <w:jc w:val="center"/>
+            </w:pPr>
+            <w:r/>
+            <w:r>
+              <w:rPr>
+                <w:rFonts w:ascii="Times New Roman" w:hAnsi="Times New Roman"/>
+                <w:sz w:val="26"/>
+              </w:rPr>
               <w:t>Bùi Thanh</w:t>
               <w:br/>
               <w:t>Minh</w:t>

</xml_diff>

<commit_message>
style: merge signature rows directly into main criteria table to guarantee perfect alignment in WPS Office and Google Docs
</commit_message>
<xml_diff>
--- a/generated_students/Bùi Thanh Minh_N25DECE057.docx
+++ b/generated_students/Bùi Thanh Minh_N25DECE057.docx
@@ -2,18 +2,6 @@
 <file path=word/document.xml><?xml version="1.0" encoding="utf-8"?>
 <w:document xmlns:wpc="http://schemas.microsoft.com/office/word/2010/wordprocessingCanvas" xmlns:mc="http://schemas.openxmlformats.org/markup-compatibility/2006" xmlns:o="urn:schemas-microsoft-com:office:office" xmlns:r="http://schemas.openxmlformats.org/officeDocument/2006/relationships" xmlns:m="http://schemas.openxmlformats.org/officeDocument/2006/math" xmlns:v="urn:schemas-microsoft-com:vml" xmlns:wp14="http://schemas.microsoft.com/office/word/2010/wordprocessingDrawing" xmlns:wp="http://schemas.openxmlformats.org/drawingml/2006/wordprocessingDrawing" xmlns:w="http://schemas.openxmlformats.org/wordprocessingml/2006/main" xmlns:w14="http://schemas.microsoft.com/office/word/2010/wordml" xmlns:w10="urn:schemas-microsoft-com:office:word" xmlns:w15="http://schemas.microsoft.com/office/word/2012/wordml" xmlns:wpg="http://schemas.microsoft.com/office/word/2010/wordprocessingGroup" xmlns:wpi="http://schemas.microsoft.com/office/word/2010/wordprocessingInk" xmlns:wne="http://schemas.microsoft.com/office/word/2006/wordml" xmlns:wps="http://schemas.microsoft.com/office/word/2010/wordprocessingShape" xmlns:wpsCustomData="http://www.wps.cn/officeDocument/2013/wpsCustomData" mc:Ignorable="w14 w15 wp14">
   <w:body>
-    <w:p>
-      <w:pPr>
-        <w:rPr>
-          <w:b/>
-          <w:bCs/>
-          <w:sz w:val="26"/>
-          <w:szCs w:val="26"/>
-          <w:u w:val="single"/>
-          <w:lang w:val="de-DE"/>
-        </w:rPr>
-      </w:pPr>
-    </w:p>
     <w:p>
       <w:pPr>
         <w:jc w:val="both"/>
@@ -289,14 +277,6 @@
         </w:tc>
       </w:tr>
     </w:tbl>
-    <w:p>
-      <w:pPr>
-        <w:spacing w:before="60" w:after="60" w:line="340" w:lineRule="exact"/>
-        <w:rPr>
-          <w:lang w:val="de-DE"/>
-        </w:rPr>
-      </w:pPr>
-    </w:p>
     <w:tbl>
       <w:tblPr>
         <w:tblStyle w:val="6"/>
@@ -9210,31 +9190,14 @@
           </w:p>
         </w:tc>
       </w:tr>
-    </w:tbl>
-    <w:tbl>
-      <w:tblPr>
-        <w:tblStyle w:val="17"/>
-        <w:tblW w:type="dxa" w:w="10522"/>
-        <w:tblLook w:firstColumn="1" w:firstRow="1" w:lastColumn="0" w:lastRow="0" w:noHBand="0" w:noVBand="1" w:val="04A0"/>
-        <w:tblInd w:w="-612" w:type="dxa"/>
-        <w:tblLayout w:type="fixed"/>
-      </w:tblPr>
-      <w:tblGrid>
-        <w:gridCol w:w="2317"/>
-        <w:gridCol w:w="2317"/>
-        <w:gridCol w:w="2317"/>
-        <w:gridCol w:w="2317"/>
-      </w:tblGrid>
       <w:tr>
         <w:trPr>
           <w:trHeight w:val="720" w:hRule="atLeast"/>
-          <w:trHeight w:val="720" w:hRule="exact"/>
-          <w:trHeight w:val="720" w:hRule="exact"/>
-          <w:trHeight w:val="720" w:hRule="exact"/>
         </w:trPr>
         <w:tc>
           <w:tcPr>
             <w:tcW w:type="dxa" w:w="2726"/>
+            <w:gridSpan w:val="4"/>
             <w:tcBorders>
               <w:top w:val="none"/>
               <w:left w:val="none"/>
@@ -9251,12 +9214,16 @@
             </w:tcMar>
           </w:tcPr>
           <w:p>
+            <w:pPr>
+              <w:spacing w:before="0" w:after="0" w:line="240" w:lineRule="auto"/>
+            </w:pPr>
             <w:r/>
           </w:p>
         </w:tc>
         <w:tc>
           <w:tcPr>
             <w:tcW w:type="dxa" w:w="2693"/>
+            <w:gridSpan w:val="2"/>
             <w:tcBorders>
               <w:top w:val="none"/>
               <w:left w:val="none"/>
@@ -9273,12 +9240,16 @@
             </w:tcMar>
           </w:tcPr>
           <w:p>
+            <w:pPr>
+              <w:spacing w:before="0" w:after="0" w:line="240" w:lineRule="auto"/>
+            </w:pPr>
             <w:r/>
           </w:p>
         </w:tc>
         <w:tc>
           <w:tcPr>
             <w:tcW w:type="dxa" w:w="2835"/>
+            <w:gridSpan w:val="4"/>
             <w:tcBorders>
               <w:top w:val="none"/>
               <w:left w:val="none"/>
@@ -9295,12 +9266,16 @@
             </w:tcMar>
           </w:tcPr>
           <w:p>
+            <w:pPr>
+              <w:spacing w:before="0" w:after="0" w:line="240" w:lineRule="auto"/>
+            </w:pPr>
             <w:r/>
           </w:p>
         </w:tc>
         <w:tc>
           <w:tcPr>
             <w:tcW w:type="dxa" w:w="2268"/>
+            <w:gridSpan w:val="5"/>
             <w:tcBorders>
               <w:top w:val="none"/>
               <w:left w:val="none"/>
@@ -9317,6 +9292,9 @@
             </w:tcMar>
           </w:tcPr>
           <w:p>
+            <w:pPr>
+              <w:spacing w:before="0" w:after="0" w:line="240" w:lineRule="auto"/>
+            </w:pPr>
             <w:r/>
           </w:p>
         </w:tc>
@@ -9325,6 +9303,7 @@
         <w:tc>
           <w:tcPr>
             <w:tcW w:type="dxa" w:w="2726"/>
+            <w:gridSpan w:val="4"/>
             <w:tcBorders>
               <w:top w:val="none"/>
               <w:left w:val="none"/>
@@ -9350,7 +9329,7 @@
               <w:drawing>
                 <wp:inline xmlns:a="http://schemas.openxmlformats.org/drawingml/2006/main" xmlns:pic="http://schemas.openxmlformats.org/drawingml/2006/picture">
                   <wp:extent cx="1296000" cy="223200"/>
-                  <wp:docPr id="3" name="Picture 3"/>
+                  <wp:docPr id="5" name="Picture 5"/>
                   <wp:cNvGraphicFramePr>
                     <a:graphicFrameLocks noChangeAspect="1"/>
                   </wp:cNvGraphicFramePr>
@@ -9385,6 +9364,7 @@
         <w:tc>
           <w:tcPr>
             <w:tcW w:type="dxa" w:w="2693"/>
+            <w:gridSpan w:val="2"/>
             <w:tcBorders>
               <w:top w:val="none"/>
               <w:left w:val="none"/>
@@ -9418,6 +9398,7 @@
         <w:tc>
           <w:tcPr>
             <w:tcW w:type="dxa" w:w="2835"/>
+            <w:gridSpan w:val="4"/>
             <w:tcBorders>
               <w:top w:val="none"/>
               <w:left w:val="none"/>
@@ -9443,7 +9424,7 @@
               <w:drawing>
                 <wp:inline xmlns:a="http://schemas.openxmlformats.org/drawingml/2006/main" xmlns:pic="http://schemas.openxmlformats.org/drawingml/2006/picture">
                   <wp:extent cx="1007999" cy="417600"/>
-                  <wp:docPr id="4" name="Picture 4"/>
+                  <wp:docPr id="6" name="Picture 6"/>
                   <wp:cNvGraphicFramePr>
                     <a:graphicFrameLocks noChangeAspect="1"/>
                   </wp:cNvGraphicFramePr>
@@ -9478,6 +9459,7 @@
         <w:tc>
           <w:tcPr>
             <w:tcW w:type="dxa" w:w="2268"/>
+            <w:gridSpan w:val="5"/>
             <w:tcBorders>
               <w:top w:val="none"/>
               <w:left w:val="none"/>

</xml_diff>

<commit_message>
fix: split grading and signature tables to prevent header repetition on page split
</commit_message>
<xml_diff>
--- a/generated_students/Bùi Thanh Minh_N25DECE057.docx
+++ b/generated_students/Bùi Thanh Minh_N25DECE057.docx
@@ -5236,7 +5236,7 @@
               <w:jc w:val="center"/>
             </w:pPr>
             <w:r>
-              <w:t>22</w:t>
+              <w:t>23</w:t>
             </w:r>
           </w:p>
         </w:tc>
@@ -6302,7 +6302,7 @@
               <w:jc w:val="center"/>
             </w:pPr>
             <w:r>
-              <w:t>16</w:t>
+              <w:t>17</w:t>
             </w:r>
           </w:p>
         </w:tc>
@@ -8879,7 +8879,7 @@
               <w:jc w:val="center"/>
             </w:pPr>
             <w:r>
-              <w:t>80</w:t>
+              <w:t>82</w:t>
             </w:r>
           </w:p>
         </w:tc>
@@ -8928,6 +8928,42 @@
           </w:p>
         </w:tc>
       </w:tr>
+    </w:tbl>
+    <w:p>
+      <w:pPr>
+        <w:spacing w:before="0" w:after="0"/>
+      </w:pPr>
+    </w:p>
+    <w:tbl>
+      <w:tblPr>
+        <w:tblStyle w:val="6"/>
+        <w:tblW w:w="10522" w:type="dxa"/>
+        <w:tblInd w:w="-612" w:type="dxa"/>
+        <w:tblLayout w:type="fixed"/>
+        <w:tblCellMar>
+          <w:top w:w="0" w:type="dxa"/>
+          <w:left w:w="108" w:type="dxa"/>
+          <w:bottom w:w="0" w:type="dxa"/>
+          <w:right w:w="108" w:type="dxa"/>
+        </w:tblCellMar>
+      </w:tblPr>
+      <w:tblGrid>
+        <w:gridCol w:w="153"/>
+        <w:gridCol w:w="159"/>
+        <w:gridCol w:w="408"/>
+        <w:gridCol w:w="2006"/>
+        <w:gridCol w:w="2528"/>
+        <w:gridCol w:w="165"/>
+        <w:gridCol w:w="748"/>
+        <w:gridCol w:w="990"/>
+        <w:gridCol w:w="990"/>
+        <w:gridCol w:w="107"/>
+        <w:gridCol w:w="793"/>
+        <w:gridCol w:w="6"/>
+        <w:gridCol w:w="847"/>
+        <w:gridCol w:w="128"/>
+        <w:gridCol w:w="494"/>
+      </w:tblGrid>
       <w:tr>
         <w:trPr>
           <w:gridBefore w:val="2"/>

</xml_diff>

<commit_message>
feat: adopt new vertical score CSV structure in grading pipeline
</commit_message>
<xml_diff>
--- a/generated_students/Bùi Thanh Minh_N25DECE057.docx
+++ b/generated_students/Bùi Thanh Minh_N25DECE057.docx
@@ -1598,9 +1598,6 @@
             <w:vAlign w:val="center"/>
           </w:tcPr>
           <w:p>
-            <w:pPr>
-              <w:jc w:val="center"/>
-            </w:pPr>
             <w:r/>
           </w:p>
         </w:tc>
@@ -1618,9 +1615,6 @@
             <w:vAlign w:val="center"/>
           </w:tcPr>
           <w:p>
-            <w:pPr>
-              <w:jc w:val="center"/>
-            </w:pPr>
             <w:r/>
           </w:p>
         </w:tc>
@@ -1637,9 +1631,6 @@
             <w:vAlign w:val="center"/>
           </w:tcPr>
           <w:p>
-            <w:pPr>
-              <w:jc w:val="center"/>
-            </w:pPr>
             <w:r/>
           </w:p>
         </w:tc>
@@ -1763,9 +1754,6 @@
             <w:vAlign w:val="center"/>
           </w:tcPr>
           <w:p>
-            <w:pPr>
-              <w:jc w:val="center"/>
-            </w:pPr>
             <w:r/>
           </w:p>
         </w:tc>
@@ -1783,9 +1771,6 @@
             <w:vAlign w:val="center"/>
           </w:tcPr>
           <w:p>
-            <w:pPr>
-              <w:jc w:val="center"/>
-            </w:pPr>
             <w:r/>
           </w:p>
         </w:tc>
@@ -1802,9 +1787,6 @@
             <w:vAlign w:val="center"/>
           </w:tcPr>
           <w:p>
-            <w:pPr>
-              <w:jc w:val="center"/>
-            </w:pPr>
             <w:r/>
           </w:p>
         </w:tc>
@@ -2099,9 +2081,6 @@
             <w:vAlign w:val="center"/>
           </w:tcPr>
           <w:p>
-            <w:pPr>
-              <w:jc w:val="center"/>
-            </w:pPr>
             <w:r/>
           </w:p>
         </w:tc>
@@ -2119,9 +2098,6 @@
             <w:vAlign w:val="center"/>
           </w:tcPr>
           <w:p>
-            <w:pPr>
-              <w:jc w:val="center"/>
-            </w:pPr>
             <w:r/>
           </w:p>
         </w:tc>
@@ -2138,9 +2114,6 @@
             <w:vAlign w:val="center"/>
           </w:tcPr>
           <w:p>
-            <w:pPr>
-              <w:jc w:val="center"/>
-            </w:pPr>
             <w:r/>
           </w:p>
         </w:tc>
@@ -2264,9 +2237,6 @@
             <w:vAlign w:val="center"/>
           </w:tcPr>
           <w:p>
-            <w:pPr>
-              <w:jc w:val="center"/>
-            </w:pPr>
             <w:r/>
           </w:p>
         </w:tc>
@@ -2284,9 +2254,6 @@
             <w:vAlign w:val="center"/>
           </w:tcPr>
           <w:p>
-            <w:pPr>
-              <w:jc w:val="center"/>
-            </w:pPr>
             <w:r/>
           </w:p>
         </w:tc>
@@ -2303,9 +2270,6 @@
             <w:vAlign w:val="center"/>
           </w:tcPr>
           <w:p>
-            <w:pPr>
-              <w:jc w:val="center"/>
-            </w:pPr>
             <w:r/>
           </w:p>
         </w:tc>
@@ -2433,12 +2397,7 @@
             <w:vAlign w:val="center"/>
           </w:tcPr>
           <w:p>
-            <w:pPr>
-              <w:jc w:val="center"/>
-            </w:pPr>
-            <w:r>
-              <w:t>0</w:t>
-            </w:r>
+            <w:r/>
           </w:p>
         </w:tc>
         <w:tc>
@@ -2455,9 +2414,6 @@
             <w:vAlign w:val="center"/>
           </w:tcPr>
           <w:p>
-            <w:pPr>
-              <w:jc w:val="center"/>
-            </w:pPr>
             <w:r/>
           </w:p>
         </w:tc>
@@ -2474,9 +2430,6 @@
             <w:vAlign w:val="center"/>
           </w:tcPr>
           <w:p>
-            <w:pPr>
-              <w:jc w:val="center"/>
-            </w:pPr>
             <w:r/>
           </w:p>
         </w:tc>
@@ -2967,12 +2920,7 @@
             <w:hideMark/>
           </w:tcPr>
           <w:p>
-            <w:pPr>
-              <w:jc w:val="center"/>
-            </w:pPr>
-            <w:r>
-              <w:t>0</w:t>
-            </w:r>
+            <w:r/>
           </w:p>
         </w:tc>
         <w:tc>
@@ -2990,9 +2938,6 @@
             <w:hideMark/>
           </w:tcPr>
           <w:p>
-            <w:pPr>
-              <w:jc w:val="center"/>
-            </w:pPr>
             <w:r/>
           </w:p>
         </w:tc>
@@ -3010,9 +2955,6 @@
             <w:hideMark/>
           </w:tcPr>
           <w:p>
-            <w:pPr>
-              <w:jc w:val="center"/>
-            </w:pPr>
             <w:r/>
           </w:p>
         </w:tc>
@@ -3141,12 +3083,7 @@
             <w:hideMark/>
           </w:tcPr>
           <w:p>
-            <w:pPr>
-              <w:jc w:val="center"/>
-            </w:pPr>
-            <w:r>
-              <w:t>0</w:t>
-            </w:r>
+            <w:r/>
           </w:p>
         </w:tc>
         <w:tc>
@@ -3164,9 +3101,6 @@
             <w:hideMark/>
           </w:tcPr>
           <w:p>
-            <w:pPr>
-              <w:jc w:val="center"/>
-            </w:pPr>
             <w:r/>
           </w:p>
         </w:tc>
@@ -3184,9 +3118,6 @@
             <w:hideMark/>
           </w:tcPr>
           <w:p>
-            <w:pPr>
-              <w:jc w:val="center"/>
-            </w:pPr>
             <w:r/>
           </w:p>
         </w:tc>
@@ -3315,12 +3246,7 @@
             <w:hideMark/>
           </w:tcPr>
           <w:p>
-            <w:pPr>
-              <w:jc w:val="center"/>
-            </w:pPr>
-            <w:r>
-              <w:t>0</w:t>
-            </w:r>
+            <w:r/>
           </w:p>
         </w:tc>
         <w:tc>
@@ -3338,9 +3264,6 @@
             <w:hideMark/>
           </w:tcPr>
           <w:p>
-            <w:pPr>
-              <w:jc w:val="center"/>
-            </w:pPr>
             <w:r/>
           </w:p>
         </w:tc>
@@ -3358,9 +3281,6 @@
             <w:hideMark/>
           </w:tcPr>
           <w:p>
-            <w:pPr>
-              <w:jc w:val="center"/>
-            </w:pPr>
             <w:r/>
           </w:p>
         </w:tc>
@@ -3489,12 +3409,7 @@
             <w:hideMark/>
           </w:tcPr>
           <w:p>
-            <w:pPr>
-              <w:jc w:val="center"/>
-            </w:pPr>
-            <w:r>
-              <w:t>0</w:t>
-            </w:r>
+            <w:r/>
           </w:p>
         </w:tc>
         <w:tc>
@@ -3512,9 +3427,6 @@
             <w:hideMark/>
           </w:tcPr>
           <w:p>
-            <w:pPr>
-              <w:jc w:val="center"/>
-            </w:pPr>
             <w:r/>
           </w:p>
         </w:tc>
@@ -3532,9 +3444,6 @@
             <w:hideMark/>
           </w:tcPr>
           <w:p>
-            <w:pPr>
-              <w:jc w:val="center"/>
-            </w:pPr>
             <w:r/>
           </w:p>
         </w:tc>
@@ -3679,9 +3588,6 @@
             <w:vAlign w:val="center"/>
           </w:tcPr>
           <w:p>
-            <w:pPr>
-              <w:jc w:val="center"/>
-            </w:pPr>
             <w:r/>
           </w:p>
         </w:tc>
@@ -3698,9 +3604,6 @@
             <w:vAlign w:val="center"/>
           </w:tcPr>
           <w:p>
-            <w:pPr>
-              <w:jc w:val="center"/>
-            </w:pPr>
             <w:r/>
           </w:p>
         </w:tc>
@@ -4597,12 +4500,7 @@
             <w:vAlign w:val="center"/>
           </w:tcPr>
           <w:p>
-            <w:pPr>
-              <w:jc w:val="center"/>
-            </w:pPr>
-            <w:r>
-              <w:t>0</w:t>
-            </w:r>
+            <w:r/>
           </w:p>
         </w:tc>
         <w:tc>
@@ -4619,9 +4517,6 @@
             <w:vAlign w:val="center"/>
           </w:tcPr>
           <w:p>
-            <w:pPr>
-              <w:jc w:val="center"/>
-            </w:pPr>
             <w:r/>
           </w:p>
         </w:tc>
@@ -4638,9 +4533,6 @@
             <w:vAlign w:val="center"/>
           </w:tcPr>
           <w:p>
-            <w:pPr>
-              <w:jc w:val="center"/>
-            </w:pPr>
             <w:r/>
           </w:p>
         </w:tc>
@@ -4767,12 +4659,7 @@
             <w:vAlign w:val="center"/>
           </w:tcPr>
           <w:p>
-            <w:pPr>
-              <w:jc w:val="center"/>
-            </w:pPr>
-            <w:r>
-              <w:t>0</w:t>
-            </w:r>
+            <w:r/>
           </w:p>
         </w:tc>
         <w:tc>
@@ -4789,9 +4676,6 @@
             <w:vAlign w:val="center"/>
           </w:tcPr>
           <w:p>
-            <w:pPr>
-              <w:jc w:val="center"/>
-            </w:pPr>
             <w:r/>
           </w:p>
         </w:tc>
@@ -4808,9 +4692,6 @@
             <w:vAlign w:val="center"/>
           </w:tcPr>
           <w:p>
-            <w:pPr>
-              <w:jc w:val="center"/>
-            </w:pPr>
             <w:r/>
           </w:p>
         </w:tc>
@@ -5089,12 +4970,7 @@
             <w:vAlign w:val="center"/>
           </w:tcPr>
           <w:p>
-            <w:pPr>
-              <w:jc w:val="center"/>
-            </w:pPr>
-            <w:r>
-              <w:t>0</w:t>
-            </w:r>
+            <w:r/>
           </w:p>
         </w:tc>
         <w:tc>
@@ -5110,9 +4986,6 @@
             <w:vAlign w:val="center"/>
           </w:tcPr>
           <w:p>
-            <w:pPr>
-              <w:jc w:val="center"/>
-            </w:pPr>
             <w:r/>
           </w:p>
         </w:tc>
@@ -5128,9 +5001,6 @@
             <w:vAlign w:val="center"/>
           </w:tcPr>
           <w:p>
-            <w:pPr>
-              <w:jc w:val="center"/>
-            </w:pPr>
             <w:r/>
           </w:p>
         </w:tc>
@@ -5409,12 +5279,7 @@
             <w:vAlign w:val="center"/>
           </w:tcPr>
           <w:p>
-            <w:pPr>
-              <w:jc w:val="center"/>
-            </w:pPr>
-            <w:r>
-              <w:t>0</w:t>
-            </w:r>
+            <w:r/>
           </w:p>
         </w:tc>
         <w:tc>
@@ -5430,9 +5295,6 @@
             <w:vAlign w:val="center"/>
           </w:tcPr>
           <w:p>
-            <w:pPr>
-              <w:jc w:val="center"/>
-            </w:pPr>
             <w:r/>
           </w:p>
         </w:tc>
@@ -5448,9 +5310,6 @@
             <w:vAlign w:val="center"/>
           </w:tcPr>
           <w:p>
-            <w:pPr>
-              <w:jc w:val="center"/>
-            </w:pPr>
             <w:r/>
           </w:p>
         </w:tc>
@@ -6505,12 +6364,7 @@
             <w:vAlign w:val="center"/>
           </w:tcPr>
           <w:p>
-            <w:pPr>
-              <w:jc w:val="center"/>
-            </w:pPr>
-            <w:r>
-              <w:t>0</w:t>
-            </w:r>
+            <w:r/>
           </w:p>
         </w:tc>
         <w:tc>
@@ -6526,9 +6380,6 @@
             <w:vAlign w:val="center"/>
           </w:tcPr>
           <w:p>
-            <w:pPr>
-              <w:jc w:val="center"/>
-            </w:pPr>
             <w:r/>
           </w:p>
         </w:tc>
@@ -6545,9 +6396,6 @@
             <w:vAlign w:val="center"/>
           </w:tcPr>
           <w:p>
-            <w:pPr>
-              <w:jc w:val="center"/>
-            </w:pPr>
             <w:r/>
           </w:p>
         </w:tc>
@@ -7619,9 +7467,6 @@
             <w:vAlign w:val="center"/>
           </w:tcPr>
           <w:p>
-            <w:pPr>
-              <w:jc w:val="center"/>
-            </w:pPr>
             <w:r/>
           </w:p>
         </w:tc>
@@ -7642,7 +7487,9 @@
             <w:pPr>
               <w:jc w:val="center"/>
             </w:pPr>
-            <w:r/>
+            <w:r>
+              <w:t>0</w:t>
+            </w:r>
           </w:p>
         </w:tc>
       </w:tr>
@@ -7781,12 +7628,7 @@
             <w:vAlign w:val="center"/>
           </w:tcPr>
           <w:p>
-            <w:pPr>
-              <w:jc w:val="center"/>
-            </w:pPr>
-            <w:r>
-              <w:t>0</w:t>
-            </w:r>
+            <w:r/>
           </w:p>
         </w:tc>
         <w:tc>
@@ -7803,9 +7645,6 @@
             <w:vAlign w:val="center"/>
           </w:tcPr>
           <w:p>
-            <w:pPr>
-              <w:jc w:val="center"/>
-            </w:pPr>
             <w:r/>
           </w:p>
         </w:tc>
@@ -7823,9 +7662,6 @@
             <w:vAlign w:val="center"/>
           </w:tcPr>
           <w:p>
-            <w:pPr>
-              <w:jc w:val="center"/>
-            </w:pPr>
             <w:r/>
           </w:p>
         </w:tc>
@@ -8194,9 +8030,6 @@
             <w:vAlign w:val="center"/>
           </w:tcPr>
           <w:p>
-            <w:pPr>
-              <w:jc w:val="center"/>
-            </w:pPr>
             <w:r/>
           </w:p>
         </w:tc>
@@ -8216,7 +8049,9 @@
             <w:pPr>
               <w:jc w:val="center"/>
             </w:pPr>
-            <w:r/>
+            <w:r>
+              <w:t>0</w:t>
+            </w:r>
           </w:p>
         </w:tc>
       </w:tr>
@@ -8634,9 +8469,6 @@
             <w:vAlign w:val="center"/>
           </w:tcPr>
           <w:p>
-            <w:pPr>
-              <w:jc w:val="center"/>
-            </w:pPr>
             <w:r/>
           </w:p>
         </w:tc>
@@ -8657,7 +8489,9 @@
             <w:pPr>
               <w:jc w:val="center"/>
             </w:pPr>
-            <w:r/>
+            <w:r>
+              <w:t>0</w:t>
+            </w:r>
           </w:p>
         </w:tc>
       </w:tr>

</xml_diff>

<commit_message>
docs & build: regenerate all student files and update structure documentation
</commit_message>
<xml_diff>
--- a/generated_students/Bùi Thanh Minh_N25DECE057.docx
+++ b/generated_students/Bùi Thanh Minh_N25DECE057.docx
@@ -415,130 +415,86 @@
     </w:p>
     <w:p>
       <w:pPr>
+        <w:tabs>
+          <w:tab w:pos="5472" w:val="left"/>
+        </w:tabs>
         <w:spacing w:before="60" w:after="60" w:line="340" w:lineRule="exact"/>
         <w:rPr>
           <w:lang w:val="de-DE"/>
         </w:rPr>
       </w:pPr>
+      <w:r/>
       <w:r>
         <w:rPr>
-          <w:lang w:val="de-DE"/>
+          <w:rFonts w:ascii="Times New Roman" w:hAnsi="Times New Roman"/>
+          <w:sz w:val="26"/>
         </w:rPr>
-        <w:t>Họ và tên:</w:t>
+        <w:t xml:space="preserve">Họ và tên: </w:t>
       </w:r>
       <w:r>
         <w:rPr>
-          <w:lang w:val="de-DE"/>
-        </w:rPr>
-        <w:t xml:space="preserve"> </w:t>
-      </w:r>
-      <w:r>
-        <w:rPr>
+          <w:rFonts w:ascii="Times New Roman" w:hAnsi="Times New Roman"/>
           <w:sz w:val="26"/>
         </w:rPr>
         <w:t>Bùi Thanh Minh</w:t>
       </w:r>
       <w:r>
-        <w:rPr>
-          <w:lang w:val="de-DE"/>
-        </w:rPr>
         <w:tab/>
       </w:r>
       <w:r>
         <w:rPr>
-          <w:lang w:val="de-DE"/>
+          <w:rFonts w:ascii="Times New Roman" w:hAnsi="Times New Roman"/>
+          <w:sz w:val="26"/>
         </w:rPr>
-        <w:tab/>
+        <w:t xml:space="preserve">Ngày sinh: </w:t>
       </w:r>
       <w:r>
         <w:rPr>
-          <w:lang w:val="de-DE"/>
+          <w:rFonts w:ascii="Times New Roman" w:hAnsi="Times New Roman"/>
+          <w:sz w:val="26"/>
         </w:rPr>
-        <w:tab/>
-      </w:r>
-      <w:r>
-        <w:rPr>
-          <w:lang w:val="de-DE"/>
-        </w:rPr>
-        <w:tab/>
-      </w:r>
-      <w:r>
-        <w:rPr>
-          <w:lang w:val="de-DE"/>
-        </w:rPr>
-        <w:t>Ngày sinh: 02/01/2007</w:t>
+        <w:t>02/01/2007</w:t>
       </w:r>
     </w:p>
     <w:p>
       <w:pPr>
+        <w:tabs>
+          <w:tab w:pos="5472" w:val="left"/>
+        </w:tabs>
         <w:spacing w:before="60" w:after="60" w:line="340" w:lineRule="exact"/>
         <w:rPr>
           <w:lang w:val="de-DE"/>
         </w:rPr>
       </w:pPr>
+      <w:r/>
       <w:r>
         <w:rPr>
-          <w:lang w:val="de-DE"/>
+          <w:rFonts w:ascii="Times New Roman" w:hAnsi="Times New Roman"/>
+          <w:sz w:val="26"/>
         </w:rPr>
-        <w:t>Mã số sinh viên</w:t>
+        <w:t xml:space="preserve">Mã số sinh viên: </w:t>
       </w:r>
       <w:r>
         <w:rPr>
-          <w:lang w:val="de-DE"/>
-        </w:rPr>
-        <w:t xml:space="preserve">: </w:t>
-      </w:r>
-      <w:r>
-        <w:rPr>
+          <w:rFonts w:ascii="Times New Roman" w:hAnsi="Times New Roman"/>
           <w:sz w:val="26"/>
         </w:rPr>
         <w:t>N25DECE057</w:t>
       </w:r>
       <w:r>
-        <w:rPr>
-          <w:sz w:val="26"/>
-        </w:rPr>
         <w:tab/>
       </w:r>
       <w:r>
         <w:rPr>
-          <w:lang w:val="de-DE"/>
+          <w:rFonts w:ascii="Times New Roman" w:hAnsi="Times New Roman"/>
+          <w:sz w:val="26"/>
         </w:rPr>
-        <w:t xml:space="preserve"> </w:t>
+        <w:t xml:space="preserve">Lớp: </w:t>
       </w:r>
       <w:r>
         <w:rPr>
-          <w:lang w:val="de-DE"/>
-        </w:rPr>
-        <w:tab/>
-      </w:r>
-      <w:r>
-        <w:rPr>
-          <w:lang w:val="de-DE"/>
-        </w:rPr>
-        <w:tab/>
-      </w:r>
-      <w:r>
-        <w:rPr>
-          <w:lang w:val="de-DE"/>
-        </w:rPr>
-        <w:tab/>
-      </w:r>
-      <w:r>
-        <w:rPr>
-          <w:lang w:val="de-DE"/>
-        </w:rPr>
-        <w:t>Lớp</w:t>
-      </w:r>
-      <w:r>
-        <w:rPr>
-          <w:lang w:val="de-DE"/>
-        </w:rPr>
-        <w:t xml:space="preserve">: </w:t>
-      </w:r>
-      <w:r>
-        <w:rPr>
-          <w:lang w:val="de-DE"/>
+          <w:rFonts w:ascii="Times New Roman" w:hAnsi="Times New Roman"/>
+          <w:sz w:val="26"/>
         </w:rPr>
         <w:t>E25CQCE02-N</w:t>
       </w:r>

</xml_diff>

<commit_message>
docs: document scoring rules, fix student name-splitting logic, resolve mathematical inconsistencies, and correct meeting attendance scores
</commit_message>
<xml_diff>
--- a/generated_students/Bùi Thanh Minh_N25DECE057.docx
+++ b/generated_students/Bùi Thanh Minh_N25DECE057.docx
@@ -1727,7 +1727,12 @@
             <w:vAlign w:val="center"/>
           </w:tcPr>
           <w:p>
-            <w:r/>
+            <w:pPr>
+              <w:jc w:val="center"/>
+            </w:pPr>
+            <w:r>
+              <w:t>8</w:t>
+            </w:r>
           </w:p>
         </w:tc>
         <w:tc>
@@ -1743,7 +1748,12 @@
             <w:vAlign w:val="center"/>
           </w:tcPr>
           <w:p>
-            <w:r/>
+            <w:pPr>
+              <w:jc w:val="center"/>
+            </w:pPr>
+            <w:r>
+              <w:t>8</w:t>
+            </w:r>
           </w:p>
         </w:tc>
       </w:tr>
@@ -1888,12 +1898,7 @@
             <w:vAlign w:val="center"/>
           </w:tcPr>
           <w:p>
-            <w:pPr>
-              <w:jc w:val="center"/>
-            </w:pPr>
-            <w:r>
-              <w:t>6</w:t>
-            </w:r>
+            <w:r/>
           </w:p>
         </w:tc>
         <w:tc>
@@ -1909,12 +1914,7 @@
             <w:vAlign w:val="center"/>
           </w:tcPr>
           <w:p>
-            <w:pPr>
-              <w:jc w:val="center"/>
-            </w:pPr>
-            <w:r>
-              <w:t>6</w:t>
-            </w:r>
+            <w:r/>
           </w:p>
         </w:tc>
       </w:tr>
@@ -9591,7 +9591,7 @@
                               <w:rPr>
                                 <w:sz w:val="26"/>
                               </w:rPr>
-                              <w:t>Bùi Thanh</w:t>
+                              <w:t>Bùi Thanh Minh</w:t>
                             </w:r>
                           </w:p>
                           <w:p>
@@ -9605,7 +9605,6 @@
                               <w:rPr>
                                 <w:sz w:val="26"/>
                               </w:rPr>
-                              <w:t>Minh</w:t>
                             </w:r>
                           </w:p>
                           <w:p>
@@ -9650,7 +9649,7 @@
                         <w:rPr>
                           <w:sz w:val="26"/>
                         </w:rPr>
-                        <w:t>Bùi Thanh</w:t>
+                        <w:t>Bùi Thanh Minh</w:t>
                       </w:r>
                     </w:p>
                     <w:p>
@@ -9664,7 +9663,6 @@
                         <w:rPr>
                           <w:sz w:val="26"/>
                         </w:rPr>
-                        <w:t>Minh</w:t>
                       </w:r>
                     </w:p>
                     <w:p>

</xml_diff>